<commit_message>
Normalize generated text and verify delivery document layout
</commit_message>
<xml_diff>
--- a/docs/device_templates_delivery.docx
+++ b/docs/device_templates_delivery.docx
@@ -69,7 +69,7 @@
           </w:tcPr>
           <w:p>
             <w:pPr>
-              <w:spacing w:after="60" w:line="264" w:lineRule="auto"/>
+              <w:spacing w:after="20" w:line="280" w:lineRule="exact"/>
             </w:pPr>
             <w:r>
               <w:rPr>
@@ -100,7 +100,7 @@
           </w:tcPr>
           <w:p>
             <w:pPr>
-              <w:spacing w:after="60" w:line="264" w:lineRule="auto"/>
+              <w:spacing w:after="20" w:line="280" w:lineRule="exact"/>
             </w:pPr>
             <w:r>
               <w:rPr>
@@ -131,7 +131,7 @@
           </w:tcPr>
           <w:p>
             <w:pPr>
-              <w:spacing w:after="60" w:line="264" w:lineRule="auto"/>
+              <w:spacing w:after="20" w:line="280" w:lineRule="exact"/>
             </w:pPr>
             <w:r>
               <w:rPr>
@@ -163,7 +163,7 @@
           </w:tcPr>
           <w:p>
             <w:pPr>
-              <w:spacing w:after="60" w:line="264" w:lineRule="auto"/>
+              <w:spacing w:after="20" w:line="280" w:lineRule="exact"/>
             </w:pPr>
             <w:r>
               <w:rPr>
@@ -192,7 +192,7 @@
           </w:tcPr>
           <w:p>
             <w:pPr>
-              <w:spacing w:after="60" w:line="264" w:lineRule="auto"/>
+              <w:spacing w:after="20" w:line="280" w:lineRule="exact"/>
             </w:pPr>
             <w:r>
               <w:rPr>
@@ -221,7 +221,7 @@
           </w:tcPr>
           <w:p>
             <w:pPr>
-              <w:spacing w:after="60" w:line="264" w:lineRule="auto"/>
+              <w:spacing w:after="20" w:line="280" w:lineRule="exact"/>
             </w:pPr>
             <w:r>
               <w:rPr>
@@ -252,7 +252,7 @@
           </w:tcPr>
           <w:p>
             <w:pPr>
-              <w:spacing w:after="60" w:line="264" w:lineRule="auto"/>
+              <w:spacing w:after="20" w:line="280" w:lineRule="exact"/>
             </w:pPr>
             <w:r>
               <w:rPr>
@@ -281,7 +281,7 @@
           </w:tcPr>
           <w:p>
             <w:pPr>
-              <w:spacing w:after="60" w:line="264" w:lineRule="auto"/>
+              <w:spacing w:after="20" w:line="280" w:lineRule="exact"/>
             </w:pPr>
             <w:r>
               <w:rPr>
@@ -310,7 +310,7 @@
           </w:tcPr>
           <w:p>
             <w:pPr>
-              <w:spacing w:after="60" w:line="264" w:lineRule="auto"/>
+              <w:spacing w:after="20" w:line="280" w:lineRule="exact"/>
             </w:pPr>
             <w:r>
               <w:rPr>
@@ -341,7 +341,7 @@
           </w:tcPr>
           <w:p>
             <w:pPr>
-              <w:spacing w:after="60" w:line="264" w:lineRule="auto"/>
+              <w:spacing w:after="20" w:line="280" w:lineRule="exact"/>
             </w:pPr>
             <w:r>
               <w:rPr>
@@ -370,7 +370,7 @@
           </w:tcPr>
           <w:p>
             <w:pPr>
-              <w:spacing w:after="60" w:line="264" w:lineRule="auto"/>
+              <w:spacing w:after="20" w:line="280" w:lineRule="exact"/>
             </w:pPr>
             <w:r>
               <w:rPr>
@@ -399,7 +399,7 @@
           </w:tcPr>
           <w:p>
             <w:pPr>
-              <w:spacing w:after="60" w:line="264" w:lineRule="auto"/>
+              <w:spacing w:after="20" w:line="280" w:lineRule="exact"/>
             </w:pPr>
             <w:r>
               <w:rPr>
@@ -411,7 +411,6 @@
         </w:tc>
       </w:tr>
     </w:tbl>
-    <w:p/>
     <w:p>
       <w:r>
         <w:t>合计 105 个部件或功能区条目，包含部件组与子部件，并不表示 105 个独立硬件。每个条目记录 ID、中文名、手册图标记、位置提示、用途、观察项、章节、PDF 页码和印刷页码。</w:t>
@@ -460,7 +459,7 @@
           </w:tcPr>
           <w:p>
             <w:pPr>
-              <w:spacing w:after="60" w:line="264" w:lineRule="auto"/>
+              <w:spacing w:after="20" w:line="280" w:lineRule="exact"/>
             </w:pPr>
             <w:r>
               <w:rPr>
@@ -491,7 +490,7 @@
           </w:tcPr>
           <w:p>
             <w:pPr>
-              <w:spacing w:after="60" w:line="264" w:lineRule="auto"/>
+              <w:spacing w:after="20" w:line="280" w:lineRule="exact"/>
             </w:pPr>
             <w:r>
               <w:rPr>
@@ -523,7 +522,7 @@
           </w:tcPr>
           <w:p>
             <w:pPr>
-              <w:spacing w:after="60" w:line="264" w:lineRule="auto"/>
+              <w:spacing w:after="20" w:line="280" w:lineRule="exact"/>
             </w:pPr>
             <w:r>
               <w:rPr>
@@ -552,7 +551,7 @@
           </w:tcPr>
           <w:p>
             <w:pPr>
-              <w:spacing w:after="60" w:line="264" w:lineRule="auto"/>
+              <w:spacing w:after="20" w:line="280" w:lineRule="exact"/>
             </w:pPr>
             <w:r>
               <w:rPr>
@@ -583,7 +582,7 @@
           </w:tcPr>
           <w:p>
             <w:pPr>
-              <w:spacing w:after="60" w:line="264" w:lineRule="auto"/>
+              <w:spacing w:after="20" w:line="280" w:lineRule="exact"/>
             </w:pPr>
             <w:r>
               <w:rPr>
@@ -612,7 +611,7 @@
           </w:tcPr>
           <w:p>
             <w:pPr>
-              <w:spacing w:after="60" w:line="264" w:lineRule="auto"/>
+              <w:spacing w:after="20" w:line="280" w:lineRule="exact"/>
             </w:pPr>
             <w:r>
               <w:rPr>
@@ -643,7 +642,7 @@
           </w:tcPr>
           <w:p>
             <w:pPr>
-              <w:spacing w:after="60" w:line="264" w:lineRule="auto"/>
+              <w:spacing w:after="20" w:line="280" w:lineRule="exact"/>
             </w:pPr>
             <w:r>
               <w:rPr>
@@ -672,7 +671,7 @@
           </w:tcPr>
           <w:p>
             <w:pPr>
-              <w:spacing w:after="60" w:line="264" w:lineRule="auto"/>
+              <w:spacing w:after="20" w:line="280" w:lineRule="exact"/>
             </w:pPr>
             <w:r>
               <w:rPr>
@@ -703,7 +702,7 @@
           </w:tcPr>
           <w:p>
             <w:pPr>
-              <w:spacing w:after="60" w:line="264" w:lineRule="auto"/>
+              <w:spacing w:after="20" w:line="280" w:lineRule="exact"/>
             </w:pPr>
             <w:r>
               <w:rPr>
@@ -732,7 +731,7 @@
           </w:tcPr>
           <w:p>
             <w:pPr>
-              <w:spacing w:after="60" w:line="264" w:lineRule="auto"/>
+              <w:spacing w:after="20" w:line="280" w:lineRule="exact"/>
             </w:pPr>
             <w:r>
               <w:rPr>
@@ -763,7 +762,7 @@
           </w:tcPr>
           <w:p>
             <w:pPr>
-              <w:spacing w:after="60" w:line="264" w:lineRule="auto"/>
+              <w:spacing w:after="20" w:line="280" w:lineRule="exact"/>
             </w:pPr>
             <w:r>
               <w:rPr>
@@ -792,7 +791,7 @@
           </w:tcPr>
           <w:p>
             <w:pPr>
-              <w:spacing w:after="60" w:line="264" w:lineRule="auto"/>
+              <w:spacing w:after="20" w:line="280" w:lineRule="exact"/>
             </w:pPr>
             <w:r>
               <w:rPr>
@@ -823,7 +822,7 @@
           </w:tcPr>
           <w:p>
             <w:pPr>
-              <w:spacing w:after="60" w:line="264" w:lineRule="auto"/>
+              <w:spacing w:after="20" w:line="280" w:lineRule="exact"/>
             </w:pPr>
             <w:r>
               <w:rPr>
@@ -852,7 +851,7 @@
           </w:tcPr>
           <w:p>
             <w:pPr>
-              <w:spacing w:after="60" w:line="264" w:lineRule="auto"/>
+              <w:spacing w:after="20" w:line="280" w:lineRule="exact"/>
             </w:pPr>
             <w:r>
               <w:rPr>
@@ -864,7 +863,6 @@
         </w:tc>
       </w:tr>
     </w:tbl>
-    <w:p/>
     <w:p>
       <w:r>
         <w:br w:type="page"/>
@@ -976,7 +974,7 @@
           </w:tcPr>
           <w:p>
             <w:pPr>
-              <w:spacing w:after="60" w:line="264" w:lineRule="auto"/>
+              <w:spacing w:after="20" w:line="280" w:lineRule="exact"/>
             </w:pPr>
             <w:r>
               <w:rPr>
@@ -1007,7 +1005,7 @@
           </w:tcPr>
           <w:p>
             <w:pPr>
-              <w:spacing w:after="60" w:line="264" w:lineRule="auto"/>
+              <w:spacing w:after="20" w:line="280" w:lineRule="exact"/>
             </w:pPr>
             <w:r>
               <w:rPr>
@@ -1038,7 +1036,7 @@
           </w:tcPr>
           <w:p>
             <w:pPr>
-              <w:spacing w:after="60" w:line="264" w:lineRule="auto"/>
+              <w:spacing w:after="20" w:line="280" w:lineRule="exact"/>
             </w:pPr>
             <w:r>
               <w:rPr>
@@ -1070,7 +1068,7 @@
           </w:tcPr>
           <w:p>
             <w:pPr>
-              <w:spacing w:after="60" w:line="264" w:lineRule="auto"/>
+              <w:spacing w:after="20" w:line="280" w:lineRule="exact"/>
             </w:pPr>
             <w:r>
               <w:rPr>
@@ -1099,7 +1097,7 @@
           </w:tcPr>
           <w:p>
             <w:pPr>
-              <w:spacing w:after="60" w:line="264" w:lineRule="auto"/>
+              <w:spacing w:after="20" w:line="280" w:lineRule="exact"/>
             </w:pPr>
             <w:r>
               <w:rPr>
@@ -1132,7 +1130,7 @@
           </w:tcPr>
           <w:p>
             <w:pPr>
-              <w:spacing w:after="60" w:line="264" w:lineRule="auto"/>
+              <w:spacing w:after="20" w:line="280" w:lineRule="exact"/>
             </w:pPr>
             <w:r>
               <w:rPr>
@@ -1167,7 +1165,7 @@
           </w:tcPr>
           <w:p>
             <w:pPr>
-              <w:spacing w:after="60" w:line="264" w:lineRule="auto"/>
+              <w:spacing w:after="20" w:line="280" w:lineRule="exact"/>
             </w:pPr>
             <w:r>
               <w:rPr>
@@ -1196,7 +1194,7 @@
           </w:tcPr>
           <w:p>
             <w:pPr>
-              <w:spacing w:after="60" w:line="264" w:lineRule="auto"/>
+              <w:spacing w:after="20" w:line="280" w:lineRule="exact"/>
             </w:pPr>
             <w:r>
               <w:rPr>
@@ -1229,7 +1227,7 @@
           </w:tcPr>
           <w:p>
             <w:pPr>
-              <w:spacing w:after="60" w:line="264" w:lineRule="auto"/>
+              <w:spacing w:after="20" w:line="280" w:lineRule="exact"/>
             </w:pPr>
             <w:r>
               <w:rPr>
@@ -1264,7 +1262,7 @@
           </w:tcPr>
           <w:p>
             <w:pPr>
-              <w:spacing w:after="60" w:line="264" w:lineRule="auto"/>
+              <w:spacing w:after="20" w:line="280" w:lineRule="exact"/>
             </w:pPr>
             <w:r>
               <w:rPr>
@@ -1293,7 +1291,7 @@
           </w:tcPr>
           <w:p>
             <w:pPr>
-              <w:spacing w:after="60" w:line="264" w:lineRule="auto"/>
+              <w:spacing w:after="20" w:line="280" w:lineRule="exact"/>
             </w:pPr>
             <w:r>
               <w:rPr>
@@ -1326,7 +1324,7 @@
           </w:tcPr>
           <w:p>
             <w:pPr>
-              <w:spacing w:after="60" w:line="264" w:lineRule="auto"/>
+              <w:spacing w:after="20" w:line="280" w:lineRule="exact"/>
             </w:pPr>
             <w:r>
               <w:rPr>
@@ -1342,7 +1340,6 @@
         </w:tc>
       </w:tr>
     </w:tbl>
-    <w:p/>
     <w:p>
       <w:r>
         <w:t>控制区条目的出处也逐项保存在 JSON 中。assets/manifest.json 记录原手册文件名、SHA256 和总页数，后续换版手册时可以核对。参考页图保留字母、箭头和说明，但其示例数字和灯光不能作为本轮现场状态。</w:t>
@@ -1904,7 +1901,8 @@
     <w:qFormat/>
     <w:rsid w:val="00FC693F"/>
     <w:pPr>
-      <w:spacing w:after="140" w:line="278" w:lineRule="auto"/>
+      <w:spacing w:after="100" w:line="300" w:lineRule="exact" w:before="0"/>
+      <w:snapToGrid w:val="0"/>
     </w:pPr>
     <w:rPr>
       <w:rFonts w:ascii="Microsoft YaHei" w:hAnsi="Microsoft YaHei" w:eastAsia="Microsoft YaHei"/>
@@ -1967,8 +1965,9 @@
     <w:pPr>
       <w:keepNext/>
       <w:keepLines/>
-      <w:spacing w:before="480" w:after="140"/>
+      <w:spacing w:before="200" w:after="100"/>
       <w:outlineLvl w:val="0"/>
+      <w:snapToGrid w:val="0"/>
     </w:pPr>
     <w:rPr>
       <w:rFonts w:asciiTheme="majorHAnsi" w:eastAsiaTheme="majorEastAsia" w:hAnsiTheme="majorHAnsi" w:cstheme="majorBidi" w:ascii="Microsoft YaHei" w:hAnsi="Microsoft YaHei" w:eastAsia="Microsoft YaHei"/>
@@ -1991,8 +1990,9 @@
     <w:pPr>
       <w:keepNext/>
       <w:keepLines/>
-      <w:spacing w:before="200" w:after="140"/>
+      <w:spacing w:before="200" w:after="100"/>
       <w:outlineLvl w:val="1"/>
+      <w:snapToGrid w:val="0"/>
     </w:pPr>
     <w:rPr>
       <w:rFonts w:asciiTheme="majorHAnsi" w:eastAsiaTheme="majorEastAsia" w:hAnsiTheme="majorHAnsi" w:cstheme="majorBidi" w:ascii="Microsoft YaHei" w:hAnsi="Microsoft YaHei" w:eastAsia="Microsoft YaHei"/>
@@ -2253,11 +2253,9 @@
     <w:qFormat/>
     <w:rsid w:val="00FC693F"/>
     <w:pPr>
-      <w:pBdr>
-        <w:bottom w:val="single" w:sz="8" w:space="4" w:color="4F81BD" w:themeColor="accent1"/>
-      </w:pBdr>
-      <w:spacing w:after="140" w:line="240" w:lineRule="auto"/>
+      <w:spacing w:after="100" w:line="240" w:lineRule="auto"/>
       <w:contextualSpacing/>
+      <w:snapToGrid w:val="0"/>
     </w:pPr>
     <w:rPr>
       <w:rFonts w:asciiTheme="majorHAnsi" w:eastAsiaTheme="majorEastAsia" w:hAnsiTheme="majorHAnsi" w:cstheme="majorBidi" w:ascii="Microsoft YaHei" w:hAnsi="Microsoft YaHei" w:eastAsia="Microsoft YaHei"/>

</xml_diff>